<commit_message>
chore: updated user guide
</commit_message>
<xml_diff>
--- a/docs/manual_usuario/Manual_de_Usuario.docx
+++ b/docs/manual_usuario/Manual_de_Usuario.docx
@@ -196,7 +196,7 @@
       <w:r>
         <w:fldChar w:fldCharType="separate"/>
       </w:r>
-      <w:hyperlink w:anchor="_Toc228537059" w:history="1">
+      <w:hyperlink w:anchor="_Toc229483936" w:history="1">
         <w:r>
           <w:rPr>
             <w:rStyle w:val="Hipervnculo"/>
@@ -239,7 +239,7 @@
           <w:rPr>
             <w:noProof/>
           </w:rPr>
-          <w:instrText xml:space="preserve"> PAGEREF _Toc228537059 \h </w:instrText>
+          <w:instrText xml:space="preserve"> PAGEREF _Toc229483936 \h </w:instrText>
         </w:r>
         <w:r>
           <w:rPr>
@@ -283,7 +283,7 @@
           <w14:ligatures w14:val="standardContextual"/>
         </w:rPr>
       </w:pPr>
-      <w:hyperlink w:anchor="_Toc228537060" w:history="1">
+      <w:hyperlink w:anchor="_Toc229483937" w:history="1">
         <w:r>
           <w:rPr>
             <w:rStyle w:val="Hipervnculo"/>
@@ -326,7 +326,7 @@
           <w:rPr>
             <w:noProof/>
           </w:rPr>
-          <w:instrText xml:space="preserve"> PAGEREF _Toc228537060 \h </w:instrText>
+          <w:instrText xml:space="preserve"> PAGEREF _Toc229483937 \h </w:instrText>
         </w:r>
         <w:r>
           <w:rPr>
@@ -370,7 +370,7 @@
           <w14:ligatures w14:val="standardContextual"/>
         </w:rPr>
       </w:pPr>
-      <w:hyperlink w:anchor="_Toc228537061" w:history="1">
+      <w:hyperlink w:anchor="_Toc229483938" w:history="1">
         <w:r>
           <w:rPr>
             <w:rStyle w:val="Hipervnculo"/>
@@ -413,7 +413,7 @@
           <w:rPr>
             <w:noProof/>
           </w:rPr>
-          <w:instrText xml:space="preserve"> PAGEREF _Toc228537061 \h </w:instrText>
+          <w:instrText xml:space="preserve"> PAGEREF _Toc229483938 \h </w:instrText>
         </w:r>
         <w:r>
           <w:rPr>
@@ -457,7 +457,7 @@
           <w14:ligatures w14:val="standardContextual"/>
         </w:rPr>
       </w:pPr>
-      <w:hyperlink w:anchor="_Toc228537062" w:history="1">
+      <w:hyperlink w:anchor="_Toc229483939" w:history="1">
         <w:r>
           <w:rPr>
             <w:rStyle w:val="Hipervnculo"/>
@@ -500,7 +500,7 @@
           <w:rPr>
             <w:noProof/>
           </w:rPr>
-          <w:instrText xml:space="preserve"> PAGEREF _Toc228537062 \h </w:instrText>
+          <w:instrText xml:space="preserve"> PAGEREF _Toc229483939 \h </w:instrText>
         </w:r>
         <w:r>
           <w:rPr>
@@ -544,7 +544,7 @@
           <w14:ligatures w14:val="standardContextual"/>
         </w:rPr>
       </w:pPr>
-      <w:hyperlink w:anchor="_Toc228537063" w:history="1">
+      <w:hyperlink w:anchor="_Toc229483940" w:history="1">
         <w:r>
           <w:rPr>
             <w:rStyle w:val="Hipervnculo"/>
@@ -587,7 +587,7 @@
           <w:rPr>
             <w:noProof/>
           </w:rPr>
-          <w:instrText xml:space="preserve"> PAGEREF _Toc228537063 \h </w:instrText>
+          <w:instrText xml:space="preserve"> PAGEREF _Toc229483940 \h </w:instrText>
         </w:r>
         <w:r>
           <w:rPr>
@@ -631,7 +631,7 @@
           <w14:ligatures w14:val="standardContextual"/>
         </w:rPr>
       </w:pPr>
-      <w:hyperlink w:anchor="_Toc228537064" w:history="1">
+      <w:hyperlink w:anchor="_Toc229483941" w:history="1">
         <w:r>
           <w:rPr>
             <w:rStyle w:val="Hipervnculo"/>
@@ -674,7 +674,7 @@
           <w:rPr>
             <w:noProof/>
           </w:rPr>
-          <w:instrText xml:space="preserve"> PAGEREF _Toc228537064 \h </w:instrText>
+          <w:instrText xml:space="preserve"> PAGEREF _Toc229483941 \h </w:instrText>
         </w:r>
         <w:r>
           <w:rPr>
@@ -718,7 +718,7 @@
           <w14:ligatures w14:val="standardContextual"/>
         </w:rPr>
       </w:pPr>
-      <w:hyperlink w:anchor="_Toc228537065" w:history="1">
+      <w:hyperlink w:anchor="_Toc229483942" w:history="1">
         <w:r>
           <w:rPr>
             <w:rStyle w:val="Hipervnculo"/>
@@ -761,7 +761,7 @@
           <w:rPr>
             <w:noProof/>
           </w:rPr>
-          <w:instrText xml:space="preserve"> PAGEREF _Toc228537065 \h </w:instrText>
+          <w:instrText xml:space="preserve"> PAGEREF _Toc229483942 \h </w:instrText>
         </w:r>
         <w:r>
           <w:rPr>
@@ -805,7 +805,7 @@
           <w14:ligatures w14:val="standardContextual"/>
         </w:rPr>
       </w:pPr>
-      <w:hyperlink w:anchor="_Toc228537066" w:history="1">
+      <w:hyperlink w:anchor="_Toc229483943" w:history="1">
         <w:r>
           <w:rPr>
             <w:rStyle w:val="Hipervnculo"/>
@@ -848,7 +848,7 @@
           <w:rPr>
             <w:noProof/>
           </w:rPr>
-          <w:instrText xml:space="preserve"> PAGEREF _Toc228537066 \h </w:instrText>
+          <w:instrText xml:space="preserve"> PAGEREF _Toc229483943 \h </w:instrText>
         </w:r>
         <w:r>
           <w:rPr>
@@ -892,7 +892,7 @@
           <w14:ligatures w14:val="standardContextual"/>
         </w:rPr>
       </w:pPr>
-      <w:hyperlink w:anchor="_Toc228537067" w:history="1">
+      <w:hyperlink w:anchor="_Toc229483944" w:history="1">
         <w:r>
           <w:rPr>
             <w:rStyle w:val="Hipervnculo"/>
@@ -935,7 +935,7 @@
           <w:rPr>
             <w:noProof/>
           </w:rPr>
-          <w:instrText xml:space="preserve"> PAGEREF _Toc228537067 \h </w:instrText>
+          <w:instrText xml:space="preserve"> PAGEREF _Toc229483944 \h </w:instrText>
         </w:r>
         <w:r>
           <w:rPr>
@@ -979,7 +979,7 @@
           <w14:ligatures w14:val="standardContextual"/>
         </w:rPr>
       </w:pPr>
-      <w:hyperlink w:anchor="_Toc228537068" w:history="1">
+      <w:hyperlink w:anchor="_Toc229483945" w:history="1">
         <w:r>
           <w:rPr>
             <w:rStyle w:val="Hipervnculo"/>
@@ -1022,7 +1022,7 @@
           <w:rPr>
             <w:noProof/>
           </w:rPr>
-          <w:instrText xml:space="preserve"> PAGEREF _Toc228537068 \h </w:instrText>
+          <w:instrText xml:space="preserve"> PAGEREF _Toc229483945 \h </w:instrText>
         </w:r>
         <w:r>
           <w:rPr>
@@ -1066,7 +1066,7 @@
           <w14:ligatures w14:val="standardContextual"/>
         </w:rPr>
       </w:pPr>
-      <w:hyperlink w:anchor="_Toc228537069" w:history="1">
+      <w:hyperlink w:anchor="_Toc229483946" w:history="1">
         <w:r>
           <w:rPr>
             <w:rStyle w:val="Hipervnculo"/>
@@ -1109,7 +1109,7 @@
           <w:rPr>
             <w:noProof/>
           </w:rPr>
-          <w:instrText xml:space="preserve"> PAGEREF _Toc228537069 \h </w:instrText>
+          <w:instrText xml:space="preserve"> PAGEREF _Toc229483946 \h </w:instrText>
         </w:r>
         <w:r>
           <w:rPr>
@@ -1153,7 +1153,7 @@
           <w14:ligatures w14:val="standardContextual"/>
         </w:rPr>
       </w:pPr>
-      <w:hyperlink w:anchor="_Toc228537070" w:history="1">
+      <w:hyperlink w:anchor="_Toc229483947" w:history="1">
         <w:r>
           <w:rPr>
             <w:rStyle w:val="Hipervnculo"/>
@@ -1196,7 +1196,7 @@
           <w:rPr>
             <w:noProof/>
           </w:rPr>
-          <w:instrText xml:space="preserve"> PAGEREF _Toc228537070 \h </w:instrText>
+          <w:instrText xml:space="preserve"> PAGEREF _Toc229483947 \h </w:instrText>
         </w:r>
         <w:r>
           <w:rPr>
@@ -1240,7 +1240,7 @@
           <w14:ligatures w14:val="standardContextual"/>
         </w:rPr>
       </w:pPr>
-      <w:hyperlink w:anchor="_Toc228537071" w:history="1">
+      <w:hyperlink w:anchor="_Toc229483948" w:history="1">
         <w:r>
           <w:rPr>
             <w:rStyle w:val="Hipervnculo"/>
@@ -1283,7 +1283,7 @@
           <w:rPr>
             <w:noProof/>
           </w:rPr>
-          <w:instrText xml:space="preserve"> PAGEREF _Toc228537071 \h </w:instrText>
+          <w:instrText xml:space="preserve"> PAGEREF _Toc229483948 \h </w:instrText>
         </w:r>
         <w:r>
           <w:rPr>
@@ -1330,7 +1330,7 @@
       <w:pPr>
         <w:pStyle w:val="Ttulo1"/>
       </w:pPr>
-      <w:bookmarkStart w:id="0" w:name="_Toc228537059"/>
+      <w:bookmarkStart w:id="0" w:name="_Toc229483936"/>
       <w:r>
         <w:t>Objeto</w:t>
       </w:r>
@@ -1351,7 +1351,7 @@
       <w:pPr>
         <w:pStyle w:val="Ttulo1"/>
       </w:pPr>
-      <w:bookmarkStart w:id="1" w:name="_Toc228537060"/>
+      <w:bookmarkStart w:id="1" w:name="_Toc229483937"/>
       <w:r>
         <w:t>Requerimientos técnicos</w:t>
       </w:r>
@@ -1366,7 +1366,7 @@
       <w:pPr>
         <w:pStyle w:val="Ttulo2"/>
       </w:pPr>
-      <w:bookmarkStart w:id="2" w:name="_Toc228537061"/>
+      <w:bookmarkStart w:id="2" w:name="_Toc229483938"/>
       <w:r>
         <w:t>Sistema Operativo</w:t>
       </w:r>
@@ -1427,7 +1427,7 @@
       <w:pPr>
         <w:pStyle w:val="Ttulo2"/>
       </w:pPr>
-      <w:bookmarkStart w:id="3" w:name="_Toc228537062"/>
+      <w:bookmarkStart w:id="3" w:name="_Toc229483939"/>
       <w:r>
         <w:t>Requisitos de Hardware (Mínimos recomendados)</w:t>
       </w:r>
@@ -1502,7 +1502,7 @@
       <w:pPr>
         <w:pStyle w:val="Ttulo1"/>
       </w:pPr>
-      <w:bookmarkStart w:id="4" w:name="_Toc228537063"/>
+      <w:bookmarkStart w:id="4" w:name="_Toc229483940"/>
       <w:r>
         <w:t>Acceso a Genesis 2.0</w:t>
       </w:r>
@@ -1517,7 +1517,7 @@
       <w:pPr>
         <w:pStyle w:val="Ttulo2"/>
       </w:pPr>
-      <w:bookmarkStart w:id="5" w:name="_Toc228537064"/>
+      <w:bookmarkStart w:id="5" w:name="_Toc229483941"/>
       <w:r>
         <w:t>Ejecución de la aplicación</w:t>
       </w:r>
@@ -1619,7 +1619,7 @@
       <w:pPr>
         <w:pStyle w:val="Ttulo2"/>
       </w:pPr>
-      <w:bookmarkStart w:id="6" w:name="_Toc228537065"/>
+      <w:bookmarkStart w:id="6" w:name="_Toc229483942"/>
       <w:r>
         <w:t>Consideraciones de Seguridad</w:t>
       </w:r>
@@ -1684,7 +1684,7 @@
       <w:pPr>
         <w:pStyle w:val="Ttulo1"/>
       </w:pPr>
-      <w:bookmarkStart w:id="7" w:name="_Toc228537066"/>
+      <w:bookmarkStart w:id="7" w:name="_Toc229483943"/>
       <w:r>
         <w:t>Glosario</w:t>
       </w:r>
@@ -3540,7 +3540,7 @@
       <w:pPr>
         <w:pStyle w:val="Ttulo1"/>
       </w:pPr>
-      <w:bookmarkStart w:id="8" w:name="_Toc228537067"/>
+      <w:bookmarkStart w:id="8" w:name="_Toc229483944"/>
       <w:r>
         <w:t>Apartados y Estructura de la Aplicación</w:t>
       </w:r>
@@ -3650,7 +3650,7 @@
       <w:pPr>
         <w:pStyle w:val="Ttulo2"/>
       </w:pPr>
-      <w:bookmarkStart w:id="9" w:name="_Toc228537068"/>
+      <w:bookmarkStart w:id="9" w:name="_Toc229483945"/>
       <w:r>
         <w:t>Gestión de Simulación</w:t>
       </w:r>
@@ -3901,12 +3901,21 @@
                 <w:bCs/>
               </w:rPr>
             </w:pPr>
-            <w:r>
-              <w:rPr>
-                <w:b/>
-                <w:bCs/>
-              </w:rPr>
-              <w:t>Nº registros por instante</w:t>
+            <w:proofErr w:type="spellStart"/>
+            <w:r>
+              <w:rPr>
+                <w:b/>
+                <w:bCs/>
+              </w:rPr>
+              <w:t>Nº</w:t>
+            </w:r>
+            <w:proofErr w:type="spellEnd"/>
+            <w:r>
+              <w:rPr>
+                <w:b/>
+                <w:bCs/>
+              </w:rPr>
+              <w:t xml:space="preserve"> registros por instante</w:t>
             </w:r>
           </w:p>
         </w:tc>
@@ -4493,8 +4502,17 @@
                 <w:b/>
                 <w:bCs/>
               </w:rPr>
-              <w:t>^pattern</w:t>
-            </w:r>
+              <w:t>^</w:t>
+            </w:r>
+            <w:proofErr w:type="spellStart"/>
+            <w:r>
+              <w:rPr>
+                <w:b/>
+                <w:bCs/>
+              </w:rPr>
+              <w:t>pattern</w:t>
+            </w:r>
+            <w:proofErr w:type="spellEnd"/>
           </w:p>
         </w:tc>
         <w:tc>
@@ -4603,7 +4621,15 @@
               <w:spacing w:after="0"/>
             </w:pPr>
             <w:r>
-              <w:t>Se asigna la marca de tiempo (timestamp) en milisegundos.</w:t>
+              <w:t>Se asigna la marca de tiempo (</w:t>
+            </w:r>
+            <w:proofErr w:type="spellStart"/>
+            <w:r>
+              <w:t>timestamp</w:t>
+            </w:r>
+            <w:proofErr w:type="spellEnd"/>
+            <w:r>
+              <w:t>) en milisegundos.</w:t>
             </w:r>
           </w:p>
         </w:tc>
@@ -4663,8 +4689,17 @@
                 <w:b/>
                 <w:bCs/>
               </w:rPr>
-              <w:t>^positionlong</w:t>
-            </w:r>
+              <w:t>^</w:t>
+            </w:r>
+            <w:proofErr w:type="spellStart"/>
+            <w:r>
+              <w:rPr>
+                <w:b/>
+                <w:bCs/>
+              </w:rPr>
+              <w:t>positionlong</w:t>
+            </w:r>
+            <w:proofErr w:type="spellEnd"/>
           </w:p>
         </w:tc>
         <w:tc>
@@ -4748,8 +4783,17 @@
                 <w:b/>
                 <w:bCs/>
               </w:rPr>
-              <w:t>^positionlat</w:t>
-            </w:r>
+              <w:t>^</w:t>
+            </w:r>
+            <w:proofErr w:type="spellStart"/>
+            <w:r>
+              <w:rPr>
+                <w:b/>
+                <w:bCs/>
+              </w:rPr>
+              <w:t>positionlat</w:t>
+            </w:r>
+            <w:proofErr w:type="spellEnd"/>
           </w:p>
         </w:tc>
         <w:tc>
@@ -4833,8 +4877,17 @@
                 <w:b/>
                 <w:bCs/>
               </w:rPr>
-              <w:t>^positioncote</w:t>
-            </w:r>
+              <w:t>^</w:t>
+            </w:r>
+            <w:proofErr w:type="spellStart"/>
+            <w:r>
+              <w:rPr>
+                <w:b/>
+                <w:bCs/>
+              </w:rPr>
+              <w:t>positioncote</w:t>
+            </w:r>
+            <w:proofErr w:type="spellEnd"/>
           </w:p>
         </w:tc>
         <w:tc>
@@ -4919,8 +4972,17 @@
                 <w:bCs/>
               </w:rPr>
               <w:lastRenderedPageBreak/>
-              <w:t>^positionalias</w:t>
-            </w:r>
+              <w:t>^</w:t>
+            </w:r>
+            <w:proofErr w:type="spellStart"/>
+            <w:r>
+              <w:rPr>
+                <w:b/>
+                <w:bCs/>
+              </w:rPr>
+              <w:t>positionalias</w:t>
+            </w:r>
+            <w:proofErr w:type="spellEnd"/>
           </w:p>
         </w:tc>
         <w:tc>
@@ -5004,8 +5066,17 @@
                 <w:b/>
                 <w:bCs/>
               </w:rPr>
-              <w:t>^positiondeveui</w:t>
-            </w:r>
+              <w:t>^</w:t>
+            </w:r>
+            <w:proofErr w:type="spellStart"/>
+            <w:r>
+              <w:rPr>
+                <w:b/>
+                <w:bCs/>
+              </w:rPr>
+              <w:t>positiondeveui</w:t>
+            </w:r>
+            <w:proofErr w:type="spellEnd"/>
           </w:p>
         </w:tc>
         <w:tc>
@@ -5029,7 +5100,15 @@
               <w:spacing w:after="0"/>
             </w:pPr>
             <w:r>
-              <w:t>Identificador DevEUI del sensor configurado.</w:t>
+              <w:t xml:space="preserve">Identificador </w:t>
+            </w:r>
+            <w:proofErr w:type="spellStart"/>
+            <w:r>
+              <w:t>DevEUI</w:t>
+            </w:r>
+            <w:proofErr w:type="spellEnd"/>
+            <w:r>
+              <w:t xml:space="preserve"> del sensor configurado.</w:t>
             </w:r>
           </w:p>
         </w:tc>
@@ -5089,8 +5168,17 @@
                 <w:b/>
                 <w:bCs/>
               </w:rPr>
-              <w:t>^positionjoineui</w:t>
-            </w:r>
+              <w:t>^</w:t>
+            </w:r>
+            <w:proofErr w:type="spellStart"/>
+            <w:r>
+              <w:rPr>
+                <w:b/>
+                <w:bCs/>
+              </w:rPr>
+              <w:t>positionjoineui</w:t>
+            </w:r>
+            <w:proofErr w:type="spellEnd"/>
           </w:p>
         </w:tc>
         <w:tc>
@@ -5114,7 +5202,15 @@
               <w:spacing w:after="0"/>
             </w:pPr>
             <w:r>
-              <w:t>Identificador JoinEUI del sensor configurado.</w:t>
+              <w:t xml:space="preserve">Identificador </w:t>
+            </w:r>
+            <w:proofErr w:type="spellStart"/>
+            <w:r>
+              <w:t>JoinEUI</w:t>
+            </w:r>
+            <w:proofErr w:type="spellEnd"/>
+            <w:r>
+              <w:t xml:space="preserve"> del sensor configurado.</w:t>
             </w:r>
           </w:p>
         </w:tc>
@@ -5174,8 +5270,17 @@
                 <w:b/>
                 <w:bCs/>
               </w:rPr>
-              <w:t>^positiondevaddr</w:t>
-            </w:r>
+              <w:t>^</w:t>
+            </w:r>
+            <w:proofErr w:type="spellStart"/>
+            <w:r>
+              <w:rPr>
+                <w:b/>
+                <w:bCs/>
+              </w:rPr>
+              <w:t>positiondevaddr</w:t>
+            </w:r>
+            <w:proofErr w:type="spellEnd"/>
           </w:p>
         </w:tc>
         <w:tc>
@@ -5199,7 +5304,15 @@
               <w:spacing w:after="0"/>
             </w:pPr>
             <w:r>
-              <w:t>Dirección DevAddr del sensor configurado.</w:t>
+              <w:t xml:space="preserve">Dirección </w:t>
+            </w:r>
+            <w:proofErr w:type="spellStart"/>
+            <w:r>
+              <w:t>DevAddr</w:t>
+            </w:r>
+            <w:proofErr w:type="spellEnd"/>
+            <w:r>
+              <w:t xml:space="preserve"> del sensor configurado.</w:t>
             </w:r>
           </w:p>
         </w:tc>
@@ -5259,7 +5372,41 @@
                 <w:b/>
                 <w:bCs/>
               </w:rPr>
-              <w:t>^int[min,max]</w:t>
+              <w:t>^</w:t>
+            </w:r>
+            <w:proofErr w:type="spellStart"/>
+            <w:r>
+              <w:rPr>
+                <w:b/>
+                <w:bCs/>
+              </w:rPr>
+              <w:t>int</w:t>
+            </w:r>
+            <w:proofErr w:type="spellEnd"/>
+            <w:r>
+              <w:rPr>
+                <w:b/>
+                <w:bCs/>
+              </w:rPr>
+              <w:t>[</w:t>
+            </w:r>
+            <w:proofErr w:type="spellStart"/>
+            <w:proofErr w:type="gramStart"/>
+            <w:r>
+              <w:rPr>
+                <w:b/>
+                <w:bCs/>
+              </w:rPr>
+              <w:t>min,max</w:t>
+            </w:r>
+            <w:proofErr w:type="spellEnd"/>
+            <w:proofErr w:type="gramEnd"/>
+            <w:r>
+              <w:rPr>
+                <w:b/>
+                <w:bCs/>
+              </w:rPr>
+              <w:t>]</w:t>
             </w:r>
           </w:p>
         </w:tc>
@@ -5309,7 +5456,20 @@
               <w:spacing w:after="0"/>
             </w:pPr>
             <w:r>
-              <w:t>^int[1,100] → 42</w:t>
+              <w:t>^</w:t>
+            </w:r>
+            <w:proofErr w:type="spellStart"/>
+            <w:proofErr w:type="gramStart"/>
+            <w:r>
+              <w:t>int</w:t>
+            </w:r>
+            <w:proofErr w:type="spellEnd"/>
+            <w:r>
+              <w:t>[</w:t>
+            </w:r>
+            <w:proofErr w:type="gramEnd"/>
+            <w:r>
+              <w:t>1,100] → 42</w:t>
             </w:r>
           </w:p>
         </w:tc>
@@ -5344,7 +5504,41 @@
                 <w:b/>
                 <w:bCs/>
               </w:rPr>
-              <w:t>^float[min,max]</w:t>
+              <w:t>^</w:t>
+            </w:r>
+            <w:proofErr w:type="spellStart"/>
+            <w:r>
+              <w:rPr>
+                <w:b/>
+                <w:bCs/>
+              </w:rPr>
+              <w:t>float</w:t>
+            </w:r>
+            <w:proofErr w:type="spellEnd"/>
+            <w:r>
+              <w:rPr>
+                <w:b/>
+                <w:bCs/>
+              </w:rPr>
+              <w:t>[</w:t>
+            </w:r>
+            <w:proofErr w:type="spellStart"/>
+            <w:proofErr w:type="gramStart"/>
+            <w:r>
+              <w:rPr>
+                <w:b/>
+                <w:bCs/>
+              </w:rPr>
+              <w:t>min,max</w:t>
+            </w:r>
+            <w:proofErr w:type="spellEnd"/>
+            <w:proofErr w:type="gramEnd"/>
+            <w:r>
+              <w:rPr>
+                <w:b/>
+                <w:bCs/>
+              </w:rPr>
+              <w:t>]</w:t>
             </w:r>
           </w:p>
         </w:tc>
@@ -5394,7 +5588,20 @@
               <w:spacing w:after="0"/>
             </w:pPr>
             <w:r>
-              <w:t>^float[0,10] → 5.74</w:t>
+              <w:t>^</w:t>
+            </w:r>
+            <w:proofErr w:type="spellStart"/>
+            <w:proofErr w:type="gramStart"/>
+            <w:r>
+              <w:t>float</w:t>
+            </w:r>
+            <w:proofErr w:type="spellEnd"/>
+            <w:r>
+              <w:t>[</w:t>
+            </w:r>
+            <w:proofErr w:type="gramEnd"/>
+            <w:r>
+              <w:t>0,10] → 5.74</w:t>
             </w:r>
           </w:p>
         </w:tc>
@@ -5429,8 +5636,17 @@
                 <w:b/>
                 <w:bCs/>
               </w:rPr>
-              <w:t>^bool</w:t>
-            </w:r>
+              <w:t>^</w:t>
+            </w:r>
+            <w:proofErr w:type="spellStart"/>
+            <w:r>
+              <w:rPr>
+                <w:b/>
+                <w:bCs/>
+              </w:rPr>
+              <w:t>bool</w:t>
+            </w:r>
+            <w:proofErr w:type="spellEnd"/>
           </w:p>
         </w:tc>
         <w:tc>
@@ -5763,7 +5979,7 @@
       <w:pPr>
         <w:pStyle w:val="Ttulo2"/>
       </w:pPr>
-      <w:bookmarkStart w:id="10" w:name="_Toc228537069"/>
+      <w:bookmarkStart w:id="10" w:name="_Toc229483946"/>
       <w:r>
         <w:t>Gestión de Sensores</w:t>
       </w:r>
@@ -5838,8 +6054,21 @@
         <w:t>longitud</w:t>
       </w:r>
       <w:r>
-        <w:t>, cota, alias, DevEui, JoinEui o DevAddr</w:t>
-      </w:r>
+        <w:t xml:space="preserve">, cota, alias, DevEui, </w:t>
+      </w:r>
+      <w:proofErr w:type="spellStart"/>
+      <w:r>
+        <w:t>JoinEui</w:t>
+      </w:r>
+      <w:proofErr w:type="spellEnd"/>
+      <w:r>
+        <w:t xml:space="preserve"> o </w:t>
+      </w:r>
+      <w:proofErr w:type="spellStart"/>
+      <w:r>
+        <w:t>DevAddr</w:t>
+      </w:r>
+      <w:proofErr w:type="spellEnd"/>
       <w:r>
         <w:t>.</w:t>
       </w:r>
@@ -5950,7 +6179,7 @@
       <w:pPr>
         <w:pStyle w:val="Ttulo2"/>
       </w:pPr>
-      <w:bookmarkStart w:id="11" w:name="_Toc228537070"/>
+      <w:bookmarkStart w:id="11" w:name="_Toc229483947"/>
       <w:r>
         <w:t>Gestión de Patrones</w:t>
       </w:r>
@@ -6459,10 +6688,10 @@
           <w:noProof/>
         </w:rPr>
         <w:drawing>
-          <wp:inline distT="0" distB="0" distL="0" distR="0" wp14:anchorId="0BD78D77" wp14:editId="09A66BFD">
-            <wp:extent cx="4485735" cy="1275519"/>
-            <wp:effectExtent l="0" t="0" r="0" b="1270"/>
-            <wp:docPr id="783989721" name="Imagen 1"/>
+          <wp:inline distT="0" distB="0" distL="0" distR="0" wp14:anchorId="5030C962" wp14:editId="50EDF1AE">
+            <wp:extent cx="4524233" cy="1241186"/>
+            <wp:effectExtent l="0" t="0" r="0" b="0"/>
+            <wp:docPr id="1225943124" name="Imagen 1"/>
             <wp:cNvGraphicFramePr>
               <a:graphicFrameLocks xmlns:a="http://schemas.openxmlformats.org/drawingml/2006/main" noChangeAspect="1"/>
             </wp:cNvGraphicFramePr>
@@ -6470,32 +6699,23 @@
               <a:graphicData uri="http://schemas.openxmlformats.org/drawingml/2006/picture">
                 <pic:pic xmlns:pic="http://schemas.openxmlformats.org/drawingml/2006/picture">
                   <pic:nvPicPr>
-                    <pic:cNvPr id="783989721" name=""/>
+                    <pic:cNvPr id="1225943124" name=""/>
                     <pic:cNvPicPr/>
                   </pic:nvPicPr>
-                  <pic:blipFill rotWithShape="1">
+                  <pic:blipFill>
                     <a:blip r:embed="rId31"/>
-                    <a:srcRect b="43343"/>
                     <a:stretch>
                       <a:fillRect/>
                     </a:stretch>
                   </pic:blipFill>
-                  <pic:spPr bwMode="auto">
+                  <pic:spPr>
                     <a:xfrm>
                       <a:off x="0" y="0"/>
-                      <a:ext cx="4552077" cy="1294383"/>
+                      <a:ext cx="4547719" cy="1247629"/>
                     </a:xfrm>
                     <a:prstGeom prst="rect">
                       <a:avLst/>
                     </a:prstGeom>
-                    <a:ln>
-                      <a:noFill/>
-                    </a:ln>
-                    <a:extLst>
-                      <a:ext uri="{53640926-AAD7-44D8-BBD7-CCE9431645EC}">
-                        <a14:shadowObscured xmlns:a14="http://schemas.microsoft.com/office/drawing/2010/main"/>
-                      </a:ext>
-                    </a:extLst>
                   </pic:spPr>
                 </pic:pic>
               </a:graphicData>
@@ -6708,18 +6928,11 @@
     </w:p>
     <w:p>
       <w:pPr>
-        <w:pageBreakBefore/>
-        <w:suppressAutoHyphens w:val="0"/>
-        <w:spacing w:line="254" w:lineRule="auto"/>
-        <w:jc w:val="left"/>
-      </w:pPr>
-    </w:p>
-    <w:p>
-      <w:pPr>
         <w:pStyle w:val="Ttulo1"/>
       </w:pPr>
-      <w:bookmarkStart w:id="12" w:name="_Toc228537071"/>
-      <w:r>
+      <w:bookmarkStart w:id="12" w:name="_Toc229483948"/>
+      <w:r>
+        <w:lastRenderedPageBreak/>
         <w:t>Simulación Paso a Paso</w:t>
       </w:r>
       <w:bookmarkEnd w:id="12"/>
@@ -6765,10 +6978,10 @@
           <w:noProof/>
         </w:rPr>
         <w:drawing>
-          <wp:inline distT="0" distB="0" distL="0" distR="0" wp14:anchorId="2D3BA27D" wp14:editId="090B53F4">
-            <wp:extent cx="5400040" cy="835025"/>
-            <wp:effectExtent l="0" t="0" r="0" b="3175"/>
-            <wp:docPr id="1447540073" name="Imagen 1"/>
+          <wp:inline distT="0" distB="0" distL="0" distR="0" wp14:anchorId="0B86952C" wp14:editId="6BCD9F5C">
+            <wp:extent cx="5400040" cy="801370"/>
+            <wp:effectExtent l="0" t="0" r="0" b="0"/>
+            <wp:docPr id="719536690" name="Imagen 1"/>
             <wp:cNvGraphicFramePr>
               <a:graphicFrameLocks xmlns:a="http://schemas.openxmlformats.org/drawingml/2006/main" noChangeAspect="1"/>
             </wp:cNvGraphicFramePr>
@@ -6776,7 +6989,7 @@
               <a:graphicData uri="http://schemas.openxmlformats.org/drawingml/2006/picture">
                 <pic:pic xmlns:pic="http://schemas.openxmlformats.org/drawingml/2006/picture">
                   <pic:nvPicPr>
-                    <pic:cNvPr id="1447540073" name=""/>
+                    <pic:cNvPr id="719536690" name=""/>
                     <pic:cNvPicPr/>
                   </pic:nvPicPr>
                   <pic:blipFill>
@@ -6788,7 +7001,7 @@
                   <pic:spPr>
                     <a:xfrm>
                       <a:off x="0" y="0"/>
-                      <a:ext cx="5400040" cy="835025"/>
+                      <a:ext cx="5400040" cy="801370"/>
                     </a:xfrm>
                     <a:prstGeom prst="rect">
                       <a:avLst/>
@@ -6904,10 +7117,10 @@
           <w:noProof/>
         </w:rPr>
         <w:drawing>
-          <wp:inline distT="0" distB="0" distL="0" distR="0" wp14:anchorId="3B826B3A" wp14:editId="26C55961">
-            <wp:extent cx="5400040" cy="733425"/>
-            <wp:effectExtent l="0" t="0" r="0" b="9525"/>
-            <wp:docPr id="680781864" name="Imagen 1"/>
+          <wp:inline distT="0" distB="0" distL="0" distR="0" wp14:anchorId="5459D3D2" wp14:editId="274C9303">
+            <wp:extent cx="5400040" cy="735965"/>
+            <wp:effectExtent l="0" t="0" r="0" b="6985"/>
+            <wp:docPr id="1586385920" name="Imagen 1"/>
             <wp:cNvGraphicFramePr>
               <a:graphicFrameLocks xmlns:a="http://schemas.openxmlformats.org/drawingml/2006/main" noChangeAspect="1"/>
             </wp:cNvGraphicFramePr>
@@ -6915,7 +7128,7 @@
               <a:graphicData uri="http://schemas.openxmlformats.org/drawingml/2006/picture">
                 <pic:pic xmlns:pic="http://schemas.openxmlformats.org/drawingml/2006/picture">
                   <pic:nvPicPr>
-                    <pic:cNvPr id="680781864" name=""/>
+                    <pic:cNvPr id="1586385920" name=""/>
                     <pic:cNvPicPr/>
                   </pic:nvPicPr>
                   <pic:blipFill>
@@ -6927,7 +7140,7 @@
                   <pic:spPr>
                     <a:xfrm>
                       <a:off x="0" y="0"/>
-                      <a:ext cx="5400040" cy="733425"/>
+                      <a:ext cx="5400040" cy="735965"/>
                     </a:xfrm>
                     <a:prstGeom prst="rect">
                       <a:avLst/>
@@ -6943,11 +7156,6 @@
     <w:p>
       <w:pPr>
         <w:pStyle w:val="Prrafodelista"/>
-      </w:pPr>
-    </w:p>
-    <w:p>
-      <w:pPr>
-        <w:pStyle w:val="Prrafodelista"/>
         <w:rPr>
           <w:b/>
           <w:bCs/>
@@ -6955,25 +7163,13 @@
           <w:szCs w:val="26"/>
         </w:rPr>
       </w:pPr>
-    </w:p>
-    <w:p>
-      <w:pPr>
-        <w:pStyle w:val="Prrafodelista"/>
+      <w:r>
         <w:rPr>
           <w:b/>
           <w:bCs/>
           <w:sz w:val="26"/>
           <w:szCs w:val="26"/>
         </w:rPr>
-      </w:pPr>
-      <w:r>
-        <w:rPr>
-          <w:b/>
-          <w:bCs/>
-          <w:sz w:val="26"/>
-          <w:szCs w:val="26"/>
-        </w:rPr>
-        <w:lastRenderedPageBreak/>
         <w:t>Importación y Exportación masiva</w:t>
       </w:r>
     </w:p>
@@ -6994,6 +7190,7 @@
         </w:numPr>
       </w:pPr>
       <w:r>
+        <w:lastRenderedPageBreak/>
         <w:t xml:space="preserve">Haz clic en el botón “Importar </w:t>
       </w:r>
       <w:r>
@@ -7252,7 +7449,6 @@
           <w:b/>
           <w:bCs/>
         </w:rPr>
-        <w:lastRenderedPageBreak/>
         <w:t>Exportar Datos:</w:t>
       </w:r>
       <w:r>
@@ -7288,6 +7484,7 @@
         <w:ind w:left="1080"/>
       </w:pPr>
       <w:r>
+        <w:lastRenderedPageBreak/>
         <w:t>Asegúrate de que los campos de las coordenadas de los sensores son correctos ya que en la simulación podrían emplearse alguno de estos datos, según si lo necesitaras.</w:t>
       </w:r>
     </w:p>
@@ -7407,10 +7604,6 @@
       </w:r>
     </w:p>
     <w:p>
-      <w:pPr>
-        <w:pStyle w:val="Prrafodelista"/>
-        <w:ind w:left="1416" w:hanging="696"/>
-      </w:pPr>
       <w:r>
         <w:t>Una vez cumplimentados los campos los cambios serán guardado</w:t>
       </w:r>
@@ -7464,7 +7657,6 @@
           <w:sz w:val="26"/>
           <w:szCs w:val="26"/>
         </w:rPr>
-        <w:lastRenderedPageBreak/>
         <w:t>Importación y Exportación</w:t>
       </w:r>
     </w:p>
@@ -7489,6 +7681,7 @@
           <w:b/>
           <w:bCs/>
         </w:rPr>
+        <w:lastRenderedPageBreak/>
         <w:t>Importar Datos</w:t>
       </w:r>
       <w:r>

</xml_diff>